<commit_message>
Seminarski RMD i Seminarski docx , da se proba preko ovog RMD da se radi
</commit_message>
<xml_diff>
--- a/report/Analiza skupa podataka - Speed Dating.docx
+++ b/report/Analiza skupa podataka - Speed Dating.docx
@@ -513,6 +513,636 @@
           <w:lang w:val="sr-Latn-RS"/>
         </w:rPr>
         <w:t>da li se ono što učesnici kažu da traže poklapa sa onim na osnovu čega zaista odlučuju.</w:t>
+      </w:r>
+    </w:p>
+    <w:p>
+      <w:pPr>
+        <w:pStyle w:val="Heading2"/>
+        <w:rPr>
+          <w:lang w:val="sr-Latn-RS"/>
+        </w:rPr>
+      </w:pPr>
+      <w:r>
+        <w:rPr>
+          <w:lang w:val="sr-Latn-RS"/>
+        </w:rPr>
+        <w:t>1.4 Struktura podataka</w:t>
+      </w:r>
+    </w:p>
+    <w:p>
+      <w:pPr>
+        <w:rPr>
+          <w:lang w:val="sr-Latn-RS"/>
+        </w:rPr>
+      </w:pPr>
+      <w:r>
+        <w:rPr>
+          <w:lang w:val="sr-Latn-RS"/>
+        </w:rPr>
+        <w:t>Svaki red u skupu podataka predstavlja jedan sastanak viđen iz ugla jednog učesnika. Pošto oba učesnika popunjavaju obrazac posle sastanka, svaki sastanak se u skupu pojavljuje dva puta, jednom iz ugla svake osobe. Zato 8.378 redova odgovara približno 4.200 sastanaka.</w:t>
+      </w:r>
+    </w:p>
+    <w:p>
+      <w:pPr>
+        <w:rPr>
+          <w:lang w:val="sr-Latn-RS"/>
+        </w:rPr>
+      </w:pPr>
+      <w:r>
+        <w:rPr>
+          <w:lang w:val="sr-Latn-RS"/>
+        </w:rPr>
+        <w:t xml:space="preserve">Ispitanik 21 (ž) , upoznala je ispitanika 40 (m). </w:t>
+      </w:r>
+    </w:p>
+    <w:p>
+      <w:r>
+        <w:rPr>
+          <w:noProof/>
+        </w:rPr>
+        <w:drawing>
+          <wp:inline distT="0" distB="0" distL="0" distR="0" wp14:anchorId="4082E7CE" wp14:editId="79039AE8">
+            <wp:extent cx="1895475" cy="523875"/>
+            <wp:effectExtent l="0" t="0" r="9525" b="9525"/>
+            <wp:docPr id="1675301743" name="Picture 1"/>
+            <wp:cNvGraphicFramePr>
+              <a:graphicFrameLocks xmlns:a="http://schemas.openxmlformats.org/drawingml/2006/main" noChangeAspect="1"/>
+            </wp:cNvGraphicFramePr>
+            <a:graphic xmlns:a="http://schemas.openxmlformats.org/drawingml/2006/main">
+              <a:graphicData uri="http://schemas.openxmlformats.org/drawingml/2006/picture">
+                <pic:pic xmlns:pic="http://schemas.openxmlformats.org/drawingml/2006/picture">
+                  <pic:nvPicPr>
+                    <pic:cNvPr id="1675301743" name=""/>
+                    <pic:cNvPicPr/>
+                  </pic:nvPicPr>
+                  <pic:blipFill>
+                    <a:blip r:embed="rId5"/>
+                    <a:stretch>
+                      <a:fillRect/>
+                    </a:stretch>
+                  </pic:blipFill>
+                  <pic:spPr>
+                    <a:xfrm>
+                      <a:off x="0" y="0"/>
+                      <a:ext cx="1895475" cy="523875"/>
+                    </a:xfrm>
+                    <a:prstGeom prst="rect">
+                      <a:avLst/>
+                    </a:prstGeom>
+                  </pic:spPr>
+                </pic:pic>
+              </a:graphicData>
+            </a:graphic>
+          </wp:inline>
+        </w:drawing>
+      </w:r>
+    </w:p>
+    <w:p>
+      <w:r>
+        <w:t xml:space="preserve">Kolona </w:t>
+      </w:r>
+      <w:proofErr w:type="spellStart"/>
+      <w:r>
+        <w:t>iid</w:t>
+      </w:r>
+      <w:proofErr w:type="spellEnd"/>
+      <w:r>
+        <w:t xml:space="preserve"> je </w:t>
+      </w:r>
+      <w:proofErr w:type="spellStart"/>
+      <w:r>
+        <w:t>jedinstveni</w:t>
+      </w:r>
+      <w:proofErr w:type="spellEnd"/>
+      <w:r>
+        <w:t xml:space="preserve"> </w:t>
+      </w:r>
+      <w:proofErr w:type="spellStart"/>
+      <w:r>
+        <w:t>broj</w:t>
+      </w:r>
+      <w:proofErr w:type="spellEnd"/>
+      <w:r>
+        <w:t xml:space="preserve"> </w:t>
+      </w:r>
+      <w:proofErr w:type="spellStart"/>
+      <w:r>
+        <w:t>učesnika</w:t>
+      </w:r>
+      <w:proofErr w:type="spellEnd"/>
+      <w:r>
+        <w:t xml:space="preserve"> u celom </w:t>
+      </w:r>
+      <w:proofErr w:type="spellStart"/>
+      <w:r>
+        <w:t>skupu</w:t>
+      </w:r>
+      <w:proofErr w:type="spellEnd"/>
+      <w:r>
+        <w:t xml:space="preserve"> </w:t>
+      </w:r>
+      <w:proofErr w:type="spellStart"/>
+      <w:r>
+        <w:t>podataka</w:t>
+      </w:r>
+      <w:proofErr w:type="spellEnd"/>
+      <w:r>
+        <w:t xml:space="preserve">. Kolona id je </w:t>
+      </w:r>
+      <w:proofErr w:type="spellStart"/>
+      <w:r>
+        <w:t>redni</w:t>
+      </w:r>
+      <w:proofErr w:type="spellEnd"/>
+      <w:r>
+        <w:t xml:space="preserve"> </w:t>
+      </w:r>
+      <w:proofErr w:type="spellStart"/>
+      <w:r>
+        <w:t>broj</w:t>
+      </w:r>
+      <w:proofErr w:type="spellEnd"/>
+      <w:r>
+        <w:t xml:space="preserve"> </w:t>
+      </w:r>
+      <w:proofErr w:type="spellStart"/>
+      <w:r>
+        <w:t>učesnika</w:t>
+      </w:r>
+      <w:proofErr w:type="spellEnd"/>
+      <w:r>
+        <w:t xml:space="preserve"> samo </w:t>
+      </w:r>
+      <w:proofErr w:type="spellStart"/>
+      <w:r>
+        <w:t>unutar</w:t>
+      </w:r>
+      <w:proofErr w:type="spellEnd"/>
+      <w:r>
+        <w:t xml:space="preserve"> </w:t>
+      </w:r>
+      <w:proofErr w:type="spellStart"/>
+      <w:r>
+        <w:t>njegovog</w:t>
+      </w:r>
+      <w:proofErr w:type="spellEnd"/>
+      <w:r>
+        <w:t xml:space="preserve"> </w:t>
+      </w:r>
+      <w:proofErr w:type="spellStart"/>
+      <w:proofErr w:type="gramStart"/>
+      <w:r>
+        <w:t>događaja:</w:t>
+      </w:r>
+      <w:r>
+        <w:t>brojanje</w:t>
+      </w:r>
+      <w:proofErr w:type="spellEnd"/>
+      <w:proofErr w:type="gramEnd"/>
+      <w:r>
+        <w:t xml:space="preserve"> </w:t>
+      </w:r>
+      <w:r>
+        <w:t xml:space="preserve"> </w:t>
+      </w:r>
+      <w:proofErr w:type="spellStart"/>
+      <w:r>
+        <w:t>kreće</w:t>
+      </w:r>
+      <w:proofErr w:type="spellEnd"/>
+      <w:r>
+        <w:t xml:space="preserve"> od 1 </w:t>
+      </w:r>
+      <w:proofErr w:type="spellStart"/>
+      <w:r>
+        <w:t>na</w:t>
+      </w:r>
+      <w:proofErr w:type="spellEnd"/>
+      <w:r>
+        <w:t xml:space="preserve"> </w:t>
+      </w:r>
+      <w:proofErr w:type="spellStart"/>
+      <w:r>
+        <w:t>svakom</w:t>
+      </w:r>
+      <w:proofErr w:type="spellEnd"/>
+      <w:r>
+        <w:t xml:space="preserve"> </w:t>
+      </w:r>
+      <w:proofErr w:type="spellStart"/>
+      <w:r>
+        <w:t>događaju</w:t>
+      </w:r>
+      <w:proofErr w:type="spellEnd"/>
+      <w:r>
+        <w:t xml:space="preserve">, pa se </w:t>
+      </w:r>
+      <w:proofErr w:type="spellStart"/>
+      <w:r>
+        <w:t>ista</w:t>
+      </w:r>
+      <w:proofErr w:type="spellEnd"/>
+      <w:r>
+        <w:t xml:space="preserve"> </w:t>
+      </w:r>
+      <w:proofErr w:type="spellStart"/>
+      <w:r>
+        <w:t>vrednost</w:t>
+      </w:r>
+      <w:proofErr w:type="spellEnd"/>
+      <w:r>
+        <w:t xml:space="preserve"> id </w:t>
+      </w:r>
+      <w:proofErr w:type="spellStart"/>
+      <w:r>
+        <w:t>javlja</w:t>
+      </w:r>
+      <w:proofErr w:type="spellEnd"/>
+      <w:r>
+        <w:t xml:space="preserve"> </w:t>
+      </w:r>
+      <w:proofErr w:type="spellStart"/>
+      <w:r>
+        <w:t>na</w:t>
+      </w:r>
+      <w:proofErr w:type="spellEnd"/>
+      <w:r>
+        <w:t xml:space="preserve"> </w:t>
+      </w:r>
+      <w:proofErr w:type="spellStart"/>
+      <w:r>
+        <w:t>svih</w:t>
+      </w:r>
+      <w:proofErr w:type="spellEnd"/>
+      <w:r>
+        <w:t xml:space="preserve"> 21 </w:t>
+      </w:r>
+      <w:proofErr w:type="spellStart"/>
+      <w:r>
+        <w:t>događaja</w:t>
+      </w:r>
+      <w:proofErr w:type="spellEnd"/>
+      <w:r>
+        <w:t xml:space="preserve"> </w:t>
+      </w:r>
+      <w:proofErr w:type="spellStart"/>
+      <w:r>
+        <w:t>i</w:t>
+      </w:r>
+      <w:proofErr w:type="spellEnd"/>
+      <w:r>
+        <w:t xml:space="preserve"> </w:t>
+      </w:r>
+      <w:proofErr w:type="spellStart"/>
+      <w:r>
+        <w:t>svaki</w:t>
+      </w:r>
+      <w:proofErr w:type="spellEnd"/>
+      <w:r>
+        <w:t xml:space="preserve"> put </w:t>
+      </w:r>
+      <w:proofErr w:type="spellStart"/>
+      <w:r>
+        <w:t>pripada</w:t>
+      </w:r>
+      <w:proofErr w:type="spellEnd"/>
+      <w:r>
+        <w:t xml:space="preserve"> </w:t>
+      </w:r>
+      <w:proofErr w:type="spellStart"/>
+      <w:r>
+        <w:t>drugoj</w:t>
+      </w:r>
+      <w:proofErr w:type="spellEnd"/>
+      <w:r>
+        <w:t xml:space="preserve"> </w:t>
+      </w:r>
+      <w:proofErr w:type="spellStart"/>
+      <w:r>
+        <w:t>osobi</w:t>
+      </w:r>
+      <w:proofErr w:type="spellEnd"/>
+      <w:r>
+        <w:t xml:space="preserve">. Zbog toga u </w:t>
+      </w:r>
+      <w:proofErr w:type="spellStart"/>
+      <w:r>
+        <w:t>analizi</w:t>
+      </w:r>
+      <w:proofErr w:type="spellEnd"/>
+      <w:r>
+        <w:t xml:space="preserve"> </w:t>
+      </w:r>
+      <w:proofErr w:type="spellStart"/>
+      <w:r>
+        <w:t>koristimo</w:t>
+      </w:r>
+      <w:proofErr w:type="spellEnd"/>
+      <w:r>
+        <w:t xml:space="preserve"> </w:t>
+      </w:r>
+      <w:proofErr w:type="spellStart"/>
+      <w:r>
+        <w:t>iid</w:t>
+      </w:r>
+      <w:proofErr w:type="spellEnd"/>
+      <w:r>
+        <w:t xml:space="preserve">, a </w:t>
+      </w:r>
+      <w:proofErr w:type="spellStart"/>
+      <w:r>
+        <w:t>ne</w:t>
+      </w:r>
+      <w:proofErr w:type="spellEnd"/>
+      <w:r>
+        <w:t xml:space="preserve"> id.</w:t>
+      </w:r>
+    </w:p>
+    <w:p>
+      <w:pPr>
+        <w:rPr>
+          <w:lang w:val="sr-Latn-RS"/>
+        </w:rPr>
+      </w:pPr>
+      <w:r>
+        <w:br/>
+        <w:t xml:space="preserve">Iz </w:t>
+      </w:r>
+      <w:proofErr w:type="spellStart"/>
+      <w:r>
+        <w:t>tabele</w:t>
+      </w:r>
+      <w:proofErr w:type="spellEnd"/>
+      <w:r>
+        <w:t xml:space="preserve"> vidimo da je </w:t>
+      </w:r>
+      <w:proofErr w:type="spellStart"/>
+      <w:r>
+        <w:t>osoba</w:t>
+      </w:r>
+      <w:proofErr w:type="spellEnd"/>
+      <w:r>
+        <w:t xml:space="preserve"> </w:t>
+      </w:r>
+      <w:proofErr w:type="spellStart"/>
+      <w:r>
+        <w:t>sa</w:t>
+      </w:r>
+      <w:proofErr w:type="spellEnd"/>
+      <w:r>
+        <w:t xml:space="preserve"> </w:t>
+      </w:r>
+      <w:proofErr w:type="spellStart"/>
+      <w:r>
+        <w:t>iid</w:t>
+      </w:r>
+      <w:proofErr w:type="spellEnd"/>
+      <w:r>
+        <w:t xml:space="preserve"> = 21 </w:t>
+      </w:r>
+      <w:proofErr w:type="spellStart"/>
+      <w:r>
+        <w:t>upoznala</w:t>
+      </w:r>
+      <w:proofErr w:type="spellEnd"/>
+      <w:r>
+        <w:t xml:space="preserve"> </w:t>
+      </w:r>
+      <w:proofErr w:type="spellStart"/>
+      <w:r>
+        <w:t>osobu</w:t>
+      </w:r>
+      <w:proofErr w:type="spellEnd"/>
+      <w:r>
+        <w:t xml:space="preserve"> </w:t>
+      </w:r>
+      <w:proofErr w:type="spellStart"/>
+      <w:r>
+        <w:t>sa</w:t>
+      </w:r>
+      <w:proofErr w:type="spellEnd"/>
+      <w:r>
+        <w:t xml:space="preserve"> </w:t>
+      </w:r>
+      <w:proofErr w:type="spellStart"/>
+      <w:r>
+        <w:t>iid</w:t>
+      </w:r>
+      <w:proofErr w:type="spellEnd"/>
+      <w:r>
+        <w:t>=40 (</w:t>
+      </w:r>
+      <w:proofErr w:type="spellStart"/>
+      <w:r>
+        <w:t>pid</w:t>
+      </w:r>
+      <w:proofErr w:type="spellEnd"/>
+      <w:r>
+        <w:t xml:space="preserve"> – partner id u </w:t>
+      </w:r>
+      <w:proofErr w:type="spellStart"/>
+      <w:r>
+        <w:t>celoj</w:t>
+      </w:r>
+      <w:proofErr w:type="spellEnd"/>
+      <w:r>
+        <w:t xml:space="preserve"> </w:t>
+      </w:r>
+      <w:proofErr w:type="spellStart"/>
+      <w:r>
+        <w:lastRenderedPageBreak/>
+        <w:t>tabeli</w:t>
+      </w:r>
+      <w:proofErr w:type="spellEnd"/>
+      <w:proofErr w:type="gramStart"/>
+      <w:r>
+        <w:t>) ,</w:t>
+      </w:r>
+      <w:proofErr w:type="gramEnd"/>
+      <w:r>
+        <w:t xml:space="preserve"> </w:t>
+      </w:r>
+      <w:proofErr w:type="spellStart"/>
+      <w:r>
+        <w:t>ocenila</w:t>
+      </w:r>
+      <w:proofErr w:type="spellEnd"/>
+      <w:r>
+        <w:t xml:space="preserve"> je </w:t>
+      </w:r>
+      <w:proofErr w:type="spellStart"/>
+      <w:r>
+        <w:t>osobu</w:t>
+      </w:r>
+      <w:proofErr w:type="spellEnd"/>
+      <w:r>
+        <w:t xml:space="preserve"> </w:t>
+      </w:r>
+      <w:proofErr w:type="spellStart"/>
+      <w:r>
+        <w:t>sa</w:t>
+      </w:r>
+      <w:proofErr w:type="spellEnd"/>
+      <w:r>
+        <w:t xml:space="preserve"> 6 </w:t>
+      </w:r>
+      <w:proofErr w:type="spellStart"/>
+      <w:r>
+        <w:t>na</w:t>
+      </w:r>
+      <w:proofErr w:type="spellEnd"/>
+      <w:r>
+        <w:t xml:space="preserve"> </w:t>
+      </w:r>
+      <w:proofErr w:type="spellStart"/>
+      <w:r>
+        <w:t>skali</w:t>
+      </w:r>
+      <w:proofErr w:type="spellEnd"/>
+      <w:r>
+        <w:t xml:space="preserve"> </w:t>
+      </w:r>
+      <w:proofErr w:type="spellStart"/>
+      <w:r>
+        <w:t>privla</w:t>
+      </w:r>
+      <w:proofErr w:type="spellEnd"/>
+      <w:r>
+        <w:rPr>
+          <w:lang w:val="sr-Latn-RS"/>
+        </w:rPr>
+        <w:t xml:space="preserve">čnosti i odluku koju je donela je bila – </w:t>
+      </w:r>
+      <w:proofErr w:type="gramStart"/>
+      <w:r>
+        <w:rPr>
+          <w:lang w:val="sr-Latn-RS"/>
+        </w:rPr>
+        <w:t>ne ,</w:t>
+      </w:r>
+      <w:proofErr w:type="gramEnd"/>
+      <w:r>
+        <w:rPr>
+          <w:lang w:val="sr-Latn-RS"/>
+        </w:rPr>
+        <w:t xml:space="preserve"> dok je osoba sa iid = 40 ocenila svog partnera na skali privlačnosti sa </w:t>
+      </w:r>
+      <w:proofErr w:type="gramStart"/>
+      <w:r>
+        <w:rPr>
+          <w:lang w:val="sr-Latn-RS"/>
+        </w:rPr>
+        <w:t>3 ,</w:t>
+      </w:r>
+      <w:proofErr w:type="gramEnd"/>
+      <w:r>
+        <w:rPr>
+          <w:lang w:val="sr-Latn-RS"/>
+        </w:rPr>
+        <w:t xml:space="preserve"> te donela odluku – ne. </w:t>
+      </w:r>
+    </w:p>
+    <w:p>
+      <w:pPr>
+        <w:rPr>
+          <w:lang w:val="sr-Latn-RS"/>
+        </w:rPr>
+      </w:pPr>
+      <w:r>
+        <w:rPr>
+          <w:lang w:val="sr-Latn-RS"/>
+        </w:rPr>
+        <w:t>Ova struktura je važna za celu analizu iz tri razloga:</w:t>
+      </w:r>
+    </w:p>
+    <w:p>
+      <w:pPr>
+        <w:pStyle w:val="ListParagraph"/>
+        <w:numPr>
+          <w:ilvl w:val="0"/>
+          <w:numId w:val="11"/>
+        </w:numPr>
+        <w:rPr>
+          <w:lang w:val="sr-Latn-RS"/>
+        </w:rPr>
+      </w:pPr>
+      <w:r>
+        <w:rPr>
+          <w:lang w:val="sr-Latn-RS"/>
+        </w:rPr>
+        <w:t xml:space="preserve">Redovi nisu nezavisni. </w:t>
+      </w:r>
+      <w:r>
+        <w:rPr>
+          <w:lang w:val="sr-Latn-RS"/>
+        </w:rPr>
+        <w:br/>
+      </w:r>
+      <w:r>
+        <w:rPr>
+          <w:lang w:val="sr-Latn-RS"/>
+        </w:rPr>
+        <w:t>Jedan učesnik se pojavljuje u 5 do 22 reda. Neki učesnici skoro svima kažu „da”, a neki skoro nikome, pa redovi iste osobe liče jedni na druge. To treba imati u vidu kod statističkih testova.</w:t>
+      </w:r>
+    </w:p>
+    <w:p>
+      <w:pPr>
+        <w:pStyle w:val="ListParagraph"/>
+        <w:numPr>
+          <w:ilvl w:val="0"/>
+          <w:numId w:val="11"/>
+        </w:numPr>
+        <w:rPr>
+          <w:lang w:val="sr-Latn-RS"/>
+        </w:rPr>
+      </w:pPr>
+      <w:r>
+        <w:rPr>
+          <w:lang w:val="sr-Latn-RS"/>
+        </w:rPr>
+        <w:t>Podela na trening i test skup radi se po učesniku.</w:t>
+      </w:r>
+      <w:r>
+        <w:rPr>
+          <w:lang w:val="sr-Latn-RS"/>
+        </w:rPr>
+        <w:br/>
+      </w:r>
+      <w:r>
+        <w:rPr>
+          <w:lang w:val="sr-Latn-RS"/>
+        </w:rPr>
+        <w:t>Ako bismo redove delili nasumično, ista osoba bi se našla i u trening i u test skupu, pa bi model „prepoznao” njene navike i izgledao bolje nego što jeste. Zato svaki učesnik mora biti ili samo u trening ili samo u test skupu.</w:t>
+      </w:r>
+    </w:p>
+    <w:p>
+      <w:pPr>
+        <w:pStyle w:val="ListParagraph"/>
+        <w:numPr>
+          <w:ilvl w:val="0"/>
+          <w:numId w:val="11"/>
+        </w:numPr>
+        <w:rPr>
+          <w:lang w:val="sr-Latn-RS"/>
+        </w:rPr>
+      </w:pPr>
+      <w:r>
+        <w:rPr>
+          <w:lang w:val="sr-Latn-RS"/>
+        </w:rPr>
+        <w:t xml:space="preserve">Neke veličine računamo po osobi, a ne po redu. </w:t>
+      </w:r>
+      <w:r>
+        <w:rPr>
+          <w:lang w:val="sr-Latn-RS"/>
+        </w:rPr>
+        <w:br/>
+      </w:r>
+      <w:r>
+        <w:rPr>
+          <w:lang w:val="sr-Latn-RS"/>
+        </w:rPr>
+        <w:t>Na primer, za prosečnu starost učesnika uzimamo jedan red po osobi, jer bi se inače osoba sa 22 sastanka računala 22 puta.</w:t>
       </w:r>
     </w:p>
     <w:sectPr>
@@ -730,6 +1360,119 @@
     </w:lvl>
   </w:abstractNum>
   <w:abstractNum w:abstractNumId="2" w15:restartNumberingAfterBreak="0">
+    <w:nsid w:val="100B2095"/>
+    <w:multiLevelType w:val="multilevel"/>
+    <w:tmpl w:val="372052CA"/>
+    <w:lvl w:ilvl="0">
+      <w:start w:val="1"/>
+      <w:numFmt w:val="bullet"/>
+      <w:lvlText w:val=""/>
+      <w:lvlJc w:val="left"/>
+      <w:pPr>
+        <w:ind w:left="405" w:hanging="405"/>
+      </w:pPr>
+      <w:rPr>
+        <w:rFonts w:ascii="Symbol" w:hAnsi="Symbol" w:hint="default"/>
+      </w:rPr>
+    </w:lvl>
+    <w:lvl w:ilvl="1">
+      <w:start w:val="1"/>
+      <w:numFmt w:val="decimal"/>
+      <w:lvlText w:val="%1.%2"/>
+      <w:lvlJc w:val="left"/>
+      <w:pPr>
+        <w:ind w:left="720" w:hanging="720"/>
+      </w:pPr>
+      <w:rPr>
+        <w:rFonts w:hint="default"/>
+      </w:rPr>
+    </w:lvl>
+    <w:lvl w:ilvl="2">
+      <w:start w:val="1"/>
+      <w:numFmt w:val="decimal"/>
+      <w:lvlText w:val="%1.%2.%3"/>
+      <w:lvlJc w:val="left"/>
+      <w:pPr>
+        <w:ind w:left="720" w:hanging="720"/>
+      </w:pPr>
+      <w:rPr>
+        <w:rFonts w:hint="default"/>
+      </w:rPr>
+    </w:lvl>
+    <w:lvl w:ilvl="3">
+      <w:start w:val="1"/>
+      <w:numFmt w:val="decimal"/>
+      <w:lvlText w:val="%1.%2.%3.%4"/>
+      <w:lvlJc w:val="left"/>
+      <w:pPr>
+        <w:ind w:left="1080" w:hanging="1080"/>
+      </w:pPr>
+      <w:rPr>
+        <w:rFonts w:hint="default"/>
+      </w:rPr>
+    </w:lvl>
+    <w:lvl w:ilvl="4">
+      <w:start w:val="1"/>
+      <w:numFmt w:val="decimal"/>
+      <w:lvlText w:val="%1.%2.%3.%4.%5"/>
+      <w:lvlJc w:val="left"/>
+      <w:pPr>
+        <w:ind w:left="1440" w:hanging="1440"/>
+      </w:pPr>
+      <w:rPr>
+        <w:rFonts w:hint="default"/>
+      </w:rPr>
+    </w:lvl>
+    <w:lvl w:ilvl="5">
+      <w:start w:val="1"/>
+      <w:numFmt w:val="decimal"/>
+      <w:lvlText w:val="%1.%2.%3.%4.%5.%6"/>
+      <w:lvlJc w:val="left"/>
+      <w:pPr>
+        <w:ind w:left="1440" w:hanging="1440"/>
+      </w:pPr>
+      <w:rPr>
+        <w:rFonts w:hint="default"/>
+      </w:rPr>
+    </w:lvl>
+    <w:lvl w:ilvl="6">
+      <w:start w:val="1"/>
+      <w:numFmt w:val="decimal"/>
+      <w:lvlText w:val="%1.%2.%3.%4.%5.%6.%7"/>
+      <w:lvlJc w:val="left"/>
+      <w:pPr>
+        <w:ind w:left="1800" w:hanging="1800"/>
+      </w:pPr>
+      <w:rPr>
+        <w:rFonts w:hint="default"/>
+      </w:rPr>
+    </w:lvl>
+    <w:lvl w:ilvl="7">
+      <w:start w:val="1"/>
+      <w:numFmt w:val="decimal"/>
+      <w:lvlText w:val="%1.%2.%3.%4.%5.%6.%7.%8"/>
+      <w:lvlJc w:val="left"/>
+      <w:pPr>
+        <w:ind w:left="2160" w:hanging="2160"/>
+      </w:pPr>
+      <w:rPr>
+        <w:rFonts w:hint="default"/>
+      </w:rPr>
+    </w:lvl>
+    <w:lvl w:ilvl="8">
+      <w:start w:val="1"/>
+      <w:numFmt w:val="decimal"/>
+      <w:lvlText w:val="%1.%2.%3.%4.%5.%6.%7.%8.%9"/>
+      <w:lvlJc w:val="left"/>
+      <w:pPr>
+        <w:ind w:left="2160" w:hanging="2160"/>
+      </w:pPr>
+      <w:rPr>
+        <w:rFonts w:hint="default"/>
+      </w:rPr>
+    </w:lvl>
+  </w:abstractNum>
+  <w:abstractNum w:abstractNumId="3" w15:restartNumberingAfterBreak="0">
     <w:nsid w:val="13322835"/>
     <w:multiLevelType w:val="hybridMultilevel"/>
     <w:tmpl w:val="32C8B14C"/>
@@ -818,7 +1561,7 @@
       </w:pPr>
     </w:lvl>
   </w:abstractNum>
-  <w:abstractNum w:abstractNumId="3" w15:restartNumberingAfterBreak="0">
+  <w:abstractNum w:abstractNumId="4" w15:restartNumberingAfterBreak="0">
     <w:nsid w:val="1B9A2544"/>
     <w:multiLevelType w:val="multilevel"/>
     <w:tmpl w:val="B8623BB4"/>
@@ -931,7 +1674,7 @@
       </w:rPr>
     </w:lvl>
   </w:abstractNum>
-  <w:abstractNum w:abstractNumId="4" w15:restartNumberingAfterBreak="0">
+  <w:abstractNum w:abstractNumId="5" w15:restartNumberingAfterBreak="0">
     <w:nsid w:val="1F0710BA"/>
     <w:multiLevelType w:val="hybridMultilevel"/>
     <w:tmpl w:val="D1BCA2B0"/>
@@ -1017,7 +1760,7 @@
       </w:pPr>
     </w:lvl>
   </w:abstractNum>
-  <w:abstractNum w:abstractNumId="5" w15:restartNumberingAfterBreak="0">
+  <w:abstractNum w:abstractNumId="6" w15:restartNumberingAfterBreak="0">
     <w:nsid w:val="2F690412"/>
     <w:multiLevelType w:val="hybridMultilevel"/>
     <w:tmpl w:val="1BDC076A"/>
@@ -1106,7 +1849,7 @@
       </w:pPr>
     </w:lvl>
   </w:abstractNum>
-  <w:abstractNum w:abstractNumId="6" w15:restartNumberingAfterBreak="0">
+  <w:abstractNum w:abstractNumId="7" w15:restartNumberingAfterBreak="0">
     <w:nsid w:val="38F25035"/>
     <w:multiLevelType w:val="multilevel"/>
     <w:tmpl w:val="3F7CCFEC"/>
@@ -1219,7 +1962,7 @@
       </w:rPr>
     </w:lvl>
   </w:abstractNum>
-  <w:abstractNum w:abstractNumId="7" w15:restartNumberingAfterBreak="0">
+  <w:abstractNum w:abstractNumId="8" w15:restartNumberingAfterBreak="0">
     <w:nsid w:val="695063BD"/>
     <w:multiLevelType w:val="multilevel"/>
     <w:tmpl w:val="3F7CCFEC"/>
@@ -1332,7 +2075,7 @@
       </w:rPr>
     </w:lvl>
   </w:abstractNum>
-  <w:abstractNum w:abstractNumId="8" w15:restartNumberingAfterBreak="0">
+  <w:abstractNum w:abstractNumId="9" w15:restartNumberingAfterBreak="0">
     <w:nsid w:val="6A593029"/>
     <w:multiLevelType w:val="hybridMultilevel"/>
     <w:tmpl w:val="2A58B6A4"/>
@@ -1421,7 +2164,7 @@
       </w:pPr>
     </w:lvl>
   </w:abstractNum>
-  <w:abstractNum w:abstractNumId="9" w15:restartNumberingAfterBreak="0">
+  <w:abstractNum w:abstractNumId="10" w15:restartNumberingAfterBreak="0">
     <w:nsid w:val="7A236FA4"/>
     <w:multiLevelType w:val="hybridMultilevel"/>
     <w:tmpl w:val="555E50EA"/>
@@ -1511,34 +2254,37 @@
     </w:lvl>
   </w:abstractNum>
   <w:num w:numId="1" w16cid:durableId="1219170485">
-    <w:abstractNumId w:val="2"/>
+    <w:abstractNumId w:val="3"/>
   </w:num>
   <w:num w:numId="2" w16cid:durableId="700128191">
-    <w:abstractNumId w:val="8"/>
+    <w:abstractNumId w:val="9"/>
   </w:num>
   <w:num w:numId="3" w16cid:durableId="441463367">
-    <w:abstractNumId w:val="5"/>
+    <w:abstractNumId w:val="6"/>
   </w:num>
   <w:num w:numId="4" w16cid:durableId="1263296241">
     <w:abstractNumId w:val="1"/>
   </w:num>
   <w:num w:numId="5" w16cid:durableId="1761679615">
-    <w:abstractNumId w:val="9"/>
+    <w:abstractNumId w:val="10"/>
   </w:num>
   <w:num w:numId="6" w16cid:durableId="340163175">
-    <w:abstractNumId w:val="4"/>
+    <w:abstractNumId w:val="5"/>
   </w:num>
   <w:num w:numId="7" w16cid:durableId="75131755">
+    <w:abstractNumId w:val="8"/>
+  </w:num>
+  <w:num w:numId="8" w16cid:durableId="1547521066">
     <w:abstractNumId w:val="7"/>
   </w:num>
-  <w:num w:numId="8" w16cid:durableId="1547521066">
-    <w:abstractNumId w:val="6"/>
-  </w:num>
   <w:num w:numId="9" w16cid:durableId="1952474036">
-    <w:abstractNumId w:val="3"/>
+    <w:abstractNumId w:val="4"/>
   </w:num>
   <w:num w:numId="10" w16cid:durableId="484664246">
     <w:abstractNumId w:val="0"/>
+  </w:num>
+  <w:num w:numId="11" w16cid:durableId="538518300">
+    <w:abstractNumId w:val="2"/>
   </w:num>
 </w:numbering>
 </file>

</xml_diff>